<commit_message>
Added Introduction and relevance
Added Introduction and relevance
</commit_message>
<xml_diff>
--- a/РТД модуль 1.docx
+++ b/РТД модуль 1.docx
@@ -1646,6 +1646,399 @@
         </w:rPr>
         <w:t>ж.</w:t>
       </w:r>
+    </w:p>
+    <w:p>
+      <w:pPr>
+        <w:jc w:val="center"/>
+        <w:rPr>
+          <w:b/>
+          <w:bCs/>
+          <w:sz w:val="28"/>
+          <w:szCs w:val="28"/>
+          <w:lang w:val="kk-KZ"/>
+        </w:rPr>
+      </w:pPr>
+      <w:r>
+        <w:rPr>
+          <w:b/>
+          <w:bCs/>
+          <w:sz w:val="28"/>
+          <w:szCs w:val="28"/>
+          <w:lang w:val="kk-KZ"/>
+        </w:rPr>
+        <w:lastRenderedPageBreak/>
+        <w:t>Кіріспе</w:t>
+      </w:r>
+    </w:p>
+    <w:p>
+      <w:pPr>
+        <w:jc w:val="both"/>
+        <w:rPr>
+          <w:sz w:val="28"/>
+          <w:szCs w:val="28"/>
+          <w:lang w:val="kk-KZ"/>
+        </w:rPr>
+      </w:pPr>
+      <w:r>
+        <w:rPr>
+          <w:sz w:val="28"/>
+          <w:szCs w:val="28"/>
+          <w:lang w:val="kk-KZ"/>
+        </w:rPr>
+        <w:t>Тақырыптың өзектілігі. Соңғы жылдары жасанды интеллект технологиялары өте жылдам дамып, көптеген салаларда қолданылып келеді. Әсіресе цифрлық контентті автоматты түрде жасау саласы қарқынды дамуда. Қазіргі алгоритмдер мәтін, сурет, дыбыс және бейнені автоматты түрде генерациялай алады.</w:t>
+      </w:r>
+    </w:p>
+    <w:p>
+      <w:pPr>
+        <w:jc w:val="both"/>
+        <w:rPr>
+          <w:sz w:val="28"/>
+          <w:szCs w:val="28"/>
+          <w:lang w:val="kk-KZ"/>
+        </w:rPr>
+      </w:pPr>
+      <w:r>
+        <w:rPr>
+          <w:sz w:val="28"/>
+          <w:szCs w:val="28"/>
+          <w:lang w:val="kk-KZ"/>
+        </w:rPr>
+        <w:t>Әлеуметтік желілердің, бейне платформалардың және онлайн маркетингтің дамуы контентке деген сұранысты арттырды. Көптеген компаниялар мен контент жасаушылар күн сайын жаңа материалдар жариялауы қажет. Сондықтан жасанды интеллект негізіндегі жүйелер контент өндірісін автоматтандырудың тиімді құралы болып табылады.</w:t>
+      </w:r>
+    </w:p>
+    <w:p>
+      <w:pPr>
+        <w:jc w:val="both"/>
+        <w:rPr>
+          <w:sz w:val="28"/>
+          <w:szCs w:val="28"/>
+          <w:lang w:val="kk-KZ"/>
+        </w:rPr>
+      </w:pPr>
+      <w:r>
+        <w:rPr>
+          <w:sz w:val="28"/>
+          <w:szCs w:val="28"/>
+          <w:lang w:val="kk-KZ"/>
+        </w:rPr>
+        <w:t xml:space="preserve">Зерттелу деңгейі. Контент генерациясы мәселесі машиналық оқыту және компьютерлік ғылымдар саласында белсенді зерттелуде. Ғылыми еңбектерде </w:t>
+      </w:r>
+      <w:proofErr w:type="spellStart"/>
+      <w:r>
+        <w:rPr>
+          <w:sz w:val="28"/>
+          <w:szCs w:val="28"/>
+          <w:lang w:val="kk-KZ"/>
+        </w:rPr>
+        <w:t>генеративті</w:t>
+      </w:r>
+      <w:proofErr w:type="spellEnd"/>
+      <w:r>
+        <w:rPr>
+          <w:sz w:val="28"/>
+          <w:szCs w:val="28"/>
+          <w:lang w:val="kk-KZ"/>
+        </w:rPr>
+        <w:t xml:space="preserve"> нейрондық желілер, табиғи тілді өңдеу, сөйлеуді синтездеу және компьютерлік көру технологиялары қарастырылады.</w:t>
+      </w:r>
+    </w:p>
+    <w:p>
+      <w:pPr>
+        <w:jc w:val="both"/>
+        <w:rPr>
+          <w:sz w:val="28"/>
+          <w:szCs w:val="28"/>
+          <w:lang w:val="kk-KZ"/>
+        </w:rPr>
+      </w:pPr>
+      <w:r>
+        <w:rPr>
+          <w:sz w:val="28"/>
+          <w:szCs w:val="28"/>
+          <w:lang w:val="kk-KZ"/>
+        </w:rPr>
+        <w:t>Жұмыстың мақсаты — мультимедиялық контентті автоматты түрде генерациялайтын AI-қосымшасының концепциясын әзірлеу.</w:t>
+      </w:r>
+    </w:p>
+    <w:p>
+      <w:pPr>
+        <w:jc w:val="both"/>
+        <w:rPr>
+          <w:sz w:val="28"/>
+          <w:szCs w:val="28"/>
+          <w:lang w:val="kk-KZ"/>
+        </w:rPr>
+      </w:pPr>
+    </w:p>
+    <w:p>
+      <w:pPr>
+        <w:jc w:val="both"/>
+        <w:rPr>
+          <w:sz w:val="28"/>
+          <w:szCs w:val="28"/>
+          <w:lang w:val="kk-KZ"/>
+        </w:rPr>
+      </w:pPr>
+    </w:p>
+    <w:p>
+      <w:pPr>
+        <w:jc w:val="both"/>
+        <w:rPr>
+          <w:sz w:val="28"/>
+          <w:szCs w:val="28"/>
+          <w:lang w:val="kk-KZ"/>
+        </w:rPr>
+      </w:pPr>
+    </w:p>
+    <w:p>
+      <w:pPr>
+        <w:jc w:val="both"/>
+        <w:rPr>
+          <w:sz w:val="28"/>
+          <w:szCs w:val="28"/>
+          <w:lang w:val="kk-KZ"/>
+        </w:rPr>
+      </w:pPr>
+    </w:p>
+    <w:p>
+      <w:pPr>
+        <w:jc w:val="both"/>
+        <w:rPr>
+          <w:sz w:val="28"/>
+          <w:szCs w:val="28"/>
+          <w:lang w:val="kk-KZ"/>
+        </w:rPr>
+      </w:pPr>
+    </w:p>
+    <w:p>
+      <w:pPr>
+        <w:jc w:val="both"/>
+        <w:rPr>
+          <w:sz w:val="28"/>
+          <w:szCs w:val="28"/>
+          <w:lang w:val="kk-KZ"/>
+        </w:rPr>
+      </w:pPr>
+    </w:p>
+    <w:p>
+      <w:pPr>
+        <w:jc w:val="both"/>
+        <w:rPr>
+          <w:sz w:val="28"/>
+          <w:szCs w:val="28"/>
+          <w:lang w:val="kk-KZ"/>
+        </w:rPr>
+      </w:pPr>
+    </w:p>
+    <w:p>
+      <w:pPr>
+        <w:jc w:val="both"/>
+        <w:rPr>
+          <w:sz w:val="28"/>
+          <w:szCs w:val="28"/>
+          <w:lang w:val="kk-KZ"/>
+        </w:rPr>
+      </w:pPr>
+    </w:p>
+    <w:p>
+      <w:pPr>
+        <w:jc w:val="both"/>
+        <w:rPr>
+          <w:sz w:val="28"/>
+          <w:szCs w:val="28"/>
+          <w:lang w:val="kk-KZ"/>
+        </w:rPr>
+      </w:pPr>
+    </w:p>
+    <w:p>
+      <w:pPr>
+        <w:jc w:val="both"/>
+        <w:rPr>
+          <w:sz w:val="28"/>
+          <w:szCs w:val="28"/>
+          <w:lang w:val="kk-KZ"/>
+        </w:rPr>
+      </w:pPr>
+    </w:p>
+    <w:p>
+      <w:pPr>
+        <w:jc w:val="both"/>
+        <w:rPr>
+          <w:sz w:val="28"/>
+          <w:szCs w:val="28"/>
+          <w:lang w:val="kk-KZ"/>
+        </w:rPr>
+      </w:pPr>
+    </w:p>
+    <w:p>
+      <w:pPr>
+        <w:jc w:val="both"/>
+        <w:rPr>
+          <w:sz w:val="28"/>
+          <w:szCs w:val="28"/>
+          <w:lang w:val="kk-KZ"/>
+        </w:rPr>
+      </w:pPr>
+    </w:p>
+    <w:p>
+      <w:pPr>
+        <w:jc w:val="both"/>
+        <w:rPr>
+          <w:sz w:val="28"/>
+          <w:szCs w:val="28"/>
+          <w:lang w:val="kk-KZ"/>
+        </w:rPr>
+      </w:pPr>
+    </w:p>
+    <w:p>
+      <w:pPr>
+        <w:jc w:val="both"/>
+        <w:rPr>
+          <w:sz w:val="28"/>
+          <w:szCs w:val="28"/>
+          <w:lang w:val="kk-KZ"/>
+        </w:rPr>
+      </w:pPr>
+    </w:p>
+    <w:p>
+      <w:pPr>
+        <w:jc w:val="both"/>
+        <w:rPr>
+          <w:sz w:val="28"/>
+          <w:szCs w:val="28"/>
+          <w:lang w:val="kk-KZ"/>
+        </w:rPr>
+      </w:pPr>
+    </w:p>
+    <w:p>
+      <w:pPr>
+        <w:jc w:val="both"/>
+        <w:rPr>
+          <w:sz w:val="28"/>
+          <w:szCs w:val="28"/>
+          <w:lang w:val="kk-KZ"/>
+        </w:rPr>
+      </w:pPr>
+    </w:p>
+    <w:p>
+      <w:pPr>
+        <w:jc w:val="both"/>
+        <w:rPr>
+          <w:sz w:val="28"/>
+          <w:szCs w:val="28"/>
+          <w:lang w:val="kk-KZ"/>
+        </w:rPr>
+      </w:pPr>
+    </w:p>
+    <w:p>
+      <w:pPr>
+        <w:jc w:val="both"/>
+        <w:rPr>
+          <w:sz w:val="28"/>
+          <w:szCs w:val="28"/>
+          <w:lang w:val="kk-KZ"/>
+        </w:rPr>
+      </w:pPr>
+    </w:p>
+    <w:p>
+      <w:pPr>
+        <w:jc w:val="both"/>
+        <w:rPr>
+          <w:sz w:val="28"/>
+          <w:szCs w:val="28"/>
+          <w:lang w:val="kk-KZ"/>
+        </w:rPr>
+      </w:pPr>
+    </w:p>
+    <w:p>
+      <w:pPr>
+        <w:jc w:val="both"/>
+        <w:rPr>
+          <w:sz w:val="28"/>
+          <w:szCs w:val="28"/>
+          <w:lang w:val="kk-KZ"/>
+        </w:rPr>
+      </w:pPr>
+    </w:p>
+    <w:p>
+      <w:pPr>
+        <w:jc w:val="both"/>
+        <w:rPr>
+          <w:sz w:val="28"/>
+          <w:szCs w:val="28"/>
+          <w:lang w:val="kk-KZ"/>
+        </w:rPr>
+      </w:pPr>
+    </w:p>
+    <w:p>
+      <w:pPr>
+        <w:jc w:val="both"/>
+        <w:rPr>
+          <w:sz w:val="28"/>
+          <w:szCs w:val="28"/>
+          <w:lang w:val="kk-KZ"/>
+        </w:rPr>
+      </w:pPr>
+    </w:p>
+    <w:p>
+      <w:pPr>
+        <w:jc w:val="both"/>
+        <w:rPr>
+          <w:sz w:val="28"/>
+          <w:szCs w:val="28"/>
+          <w:lang w:val="kk-KZ"/>
+        </w:rPr>
+      </w:pPr>
+    </w:p>
+    <w:p>
+      <w:pPr>
+        <w:jc w:val="both"/>
+        <w:rPr>
+          <w:sz w:val="28"/>
+          <w:szCs w:val="28"/>
+          <w:lang w:val="kk-KZ"/>
+        </w:rPr>
+      </w:pPr>
+    </w:p>
+    <w:p>
+      <w:pPr>
+        <w:jc w:val="both"/>
+        <w:rPr>
+          <w:sz w:val="28"/>
+          <w:szCs w:val="28"/>
+          <w:lang w:val="kk-KZ"/>
+        </w:rPr>
+      </w:pPr>
+    </w:p>
+    <w:p>
+      <w:pPr>
+        <w:jc w:val="both"/>
+        <w:rPr>
+          <w:sz w:val="28"/>
+          <w:szCs w:val="28"/>
+          <w:lang w:val="kk-KZ"/>
+        </w:rPr>
+      </w:pPr>
+    </w:p>
+    <w:p>
+      <w:pPr>
+        <w:jc w:val="both"/>
+        <w:rPr>
+          <w:sz w:val="28"/>
+          <w:szCs w:val="28"/>
+          <w:lang w:val="kk-KZ"/>
+        </w:rPr>
+      </w:pPr>
+    </w:p>
+    <w:p>
+      <w:pPr>
+        <w:jc w:val="both"/>
+        <w:rPr>
+          <w:sz w:val="28"/>
+          <w:szCs w:val="28"/>
+          <w:lang w:val="kk-KZ"/>
+        </w:rPr>
+      </w:pPr>
     </w:p>
     <w:sectPr>
       <w:pgSz w:w="11906" w:h="16838"/>

</xml_diff>

<commit_message>
Added theoretical framework and glossary
Added theoretical framework and glossary
</commit_message>
<xml_diff>
--- a/РТД модуль 1.docx
+++ b/РТД модуль 1.docx
@@ -2029,6 +2029,874 @@
           <w:lang w:val="kk-KZ"/>
         </w:rPr>
       </w:pPr>
+    </w:p>
+    <w:p>
+      <w:pPr>
+        <w:jc w:val="both"/>
+        <w:rPr>
+          <w:sz w:val="28"/>
+          <w:szCs w:val="28"/>
+          <w:lang w:val="kk-KZ"/>
+        </w:rPr>
+      </w:pPr>
+    </w:p>
+    <w:p>
+      <w:pPr>
+        <w:jc w:val="both"/>
+        <w:rPr>
+          <w:sz w:val="28"/>
+          <w:szCs w:val="28"/>
+          <w:lang w:val="kk-KZ"/>
+        </w:rPr>
+      </w:pPr>
+      <w:r>
+        <w:rPr>
+          <w:sz w:val="28"/>
+          <w:szCs w:val="28"/>
+          <w:lang w:val="kk-KZ"/>
+        </w:rPr>
+        <w:t>Жұмыстың міндеттері:</w:t>
+      </w:r>
+    </w:p>
+    <w:p>
+      <w:pPr>
+        <w:jc w:val="both"/>
+        <w:rPr>
+          <w:sz w:val="28"/>
+          <w:szCs w:val="28"/>
+          <w:lang w:val="kk-KZ"/>
+        </w:rPr>
+      </w:pPr>
+      <w:r>
+        <w:rPr>
+          <w:sz w:val="28"/>
+          <w:szCs w:val="28"/>
+          <w:lang w:val="kk-KZ"/>
+        </w:rPr>
+        <w:t>1. Жасанды интеллект технологияларын зерттеу.</w:t>
+      </w:r>
+    </w:p>
+    <w:p>
+      <w:pPr>
+        <w:jc w:val="both"/>
+        <w:rPr>
+          <w:sz w:val="28"/>
+          <w:szCs w:val="28"/>
+          <w:lang w:val="kk-KZ"/>
+        </w:rPr>
+      </w:pPr>
+      <w:r>
+        <w:rPr>
+          <w:sz w:val="28"/>
+          <w:szCs w:val="28"/>
+          <w:lang w:val="kk-KZ"/>
+        </w:rPr>
+        <w:t>2. Контент генерациясына арналған жүйелерді талдау.</w:t>
+      </w:r>
+    </w:p>
+    <w:p>
+      <w:pPr>
+        <w:jc w:val="both"/>
+        <w:rPr>
+          <w:sz w:val="28"/>
+          <w:szCs w:val="28"/>
+          <w:lang w:val="kk-KZ"/>
+        </w:rPr>
+      </w:pPr>
+      <w:r>
+        <w:rPr>
+          <w:sz w:val="28"/>
+          <w:szCs w:val="28"/>
+          <w:lang w:val="kk-KZ"/>
+        </w:rPr>
+        <w:t>3. Жүйе архитектурасын анықтау.</w:t>
+      </w:r>
+    </w:p>
+    <w:p>
+      <w:pPr>
+        <w:jc w:val="both"/>
+        <w:rPr>
+          <w:sz w:val="28"/>
+          <w:szCs w:val="28"/>
+          <w:lang w:val="kk-KZ"/>
+        </w:rPr>
+      </w:pPr>
+      <w:r>
+        <w:rPr>
+          <w:sz w:val="28"/>
+          <w:szCs w:val="28"/>
+          <w:lang w:val="kk-KZ"/>
+        </w:rPr>
+        <w:t>4. Қосымшаның функционалдық модульдерін сипаттау.</w:t>
+      </w:r>
+    </w:p>
+    <w:p>
+      <w:pPr>
+        <w:jc w:val="both"/>
+        <w:rPr>
+          <w:sz w:val="28"/>
+          <w:szCs w:val="28"/>
+          <w:lang w:val="kk-KZ"/>
+        </w:rPr>
+      </w:pPr>
+      <w:r>
+        <w:rPr>
+          <w:sz w:val="28"/>
+          <w:szCs w:val="28"/>
+          <w:lang w:val="kk-KZ"/>
+        </w:rPr>
+        <w:t>5. Бейне және аудио өңдеу технологияларын қарастыру.</w:t>
+      </w:r>
+    </w:p>
+    <w:p>
+      <w:pPr>
+        <w:jc w:val="both"/>
+        <w:rPr>
+          <w:sz w:val="28"/>
+          <w:szCs w:val="28"/>
+          <w:lang w:val="kk-KZ"/>
+        </w:rPr>
+      </w:pPr>
+      <w:r>
+        <w:rPr>
+          <w:sz w:val="28"/>
+          <w:szCs w:val="28"/>
+          <w:lang w:val="kk-KZ"/>
+        </w:rPr>
+        <w:t>Зерттеу объектісі — мультимедиялық контентті генерациялау жүйелері.</w:t>
+      </w:r>
+    </w:p>
+    <w:p>
+      <w:pPr>
+        <w:jc w:val="both"/>
+        <w:rPr>
+          <w:sz w:val="28"/>
+          <w:szCs w:val="28"/>
+          <w:lang w:val="kk-KZ"/>
+        </w:rPr>
+      </w:pPr>
+      <w:r>
+        <w:rPr>
+          <w:sz w:val="28"/>
+          <w:szCs w:val="28"/>
+          <w:lang w:val="kk-KZ"/>
+        </w:rPr>
+        <w:t xml:space="preserve">Зерттеу пәні — мәтін, сурет және бейнені </w:t>
+      </w:r>
+      <w:proofErr w:type="spellStart"/>
+      <w:r>
+        <w:rPr>
+          <w:sz w:val="28"/>
+          <w:szCs w:val="28"/>
+          <w:lang w:val="kk-KZ"/>
+        </w:rPr>
+        <w:t>генерациялауда</w:t>
+      </w:r>
+      <w:proofErr w:type="spellEnd"/>
+      <w:r>
+        <w:rPr>
+          <w:sz w:val="28"/>
+          <w:szCs w:val="28"/>
+          <w:lang w:val="kk-KZ"/>
+        </w:rPr>
+        <w:t xml:space="preserve"> қолданылатын жасанды интеллект алгоритмдері.</w:t>
+      </w:r>
+    </w:p>
+    <w:p>
+      <w:pPr>
+        <w:jc w:val="both"/>
+        <w:rPr>
+          <w:sz w:val="28"/>
+          <w:szCs w:val="28"/>
+          <w:lang w:val="kk-KZ"/>
+        </w:rPr>
+      </w:pPr>
+      <w:r>
+        <w:rPr>
+          <w:sz w:val="28"/>
+          <w:szCs w:val="28"/>
+          <w:lang w:val="kk-KZ"/>
+        </w:rPr>
+        <w:t>Зерттеу әдістері: ғылыми әдебиеттерді талдау, салыстырмалы талдау және бағдарламалық жүйені жобалау.</w:t>
+      </w:r>
+    </w:p>
+    <w:p>
+      <w:pPr>
+        <w:jc w:val="both"/>
+        <w:rPr>
+          <w:sz w:val="28"/>
+          <w:szCs w:val="28"/>
+          <w:lang w:val="kk-KZ"/>
+        </w:rPr>
+      </w:pPr>
+      <w:r>
+        <w:rPr>
+          <w:sz w:val="28"/>
+          <w:szCs w:val="28"/>
+          <w:lang w:val="kk-KZ"/>
+        </w:rPr>
+        <w:t>Жұмыстың құрылымы: жұмыс кіріспеден, теориялық бөлімнен, жобалық бөлімнен, құжаттаманы басқару бөлімінен және қорытындыдан тұрады.</w:t>
+      </w:r>
+    </w:p>
+    <w:p>
+      <w:pPr>
+        <w:jc w:val="both"/>
+        <w:rPr>
+          <w:sz w:val="28"/>
+          <w:szCs w:val="28"/>
+          <w:lang w:val="kk-KZ"/>
+        </w:rPr>
+      </w:pPr>
+    </w:p>
+    <w:p>
+      <w:pPr>
+        <w:jc w:val="both"/>
+        <w:rPr>
+          <w:sz w:val="28"/>
+          <w:szCs w:val="28"/>
+          <w:lang w:val="kk-KZ"/>
+        </w:rPr>
+      </w:pPr>
+      <w:r>
+        <w:rPr>
+          <w:b/>
+          <w:bCs/>
+          <w:sz w:val="28"/>
+          <w:szCs w:val="28"/>
+          <w:lang w:val="kk-KZ"/>
+        </w:rPr>
+        <w:t>1-Тарау</w:t>
+      </w:r>
+      <w:r>
+        <w:rPr>
+          <w:sz w:val="28"/>
+          <w:szCs w:val="28"/>
+          <w:lang w:val="kk-KZ"/>
+        </w:rPr>
+        <w:t>. Жасанды интеллект технологияларының теориялық негіздері</w:t>
+      </w:r>
+    </w:p>
+    <w:p>
+      <w:pPr>
+        <w:jc w:val="both"/>
+        <w:rPr>
+          <w:sz w:val="28"/>
+          <w:szCs w:val="28"/>
+          <w:lang w:val="kk-KZ"/>
+        </w:rPr>
+      </w:pPr>
+      <w:r>
+        <w:rPr>
+          <w:sz w:val="28"/>
+          <w:szCs w:val="28"/>
+          <w:lang w:val="kk-KZ"/>
+        </w:rPr>
+        <w:t>1.1 Пәндік салаға шолу</w:t>
+      </w:r>
+    </w:p>
+    <w:p>
+      <w:pPr>
+        <w:jc w:val="both"/>
+        <w:rPr>
+          <w:sz w:val="28"/>
+          <w:szCs w:val="28"/>
+          <w:lang w:val="kk-KZ"/>
+        </w:rPr>
+      </w:pPr>
+      <w:r>
+        <w:rPr>
+          <w:sz w:val="28"/>
+          <w:szCs w:val="28"/>
+          <w:lang w:val="kk-KZ"/>
+        </w:rPr>
+        <w:t>Жасанды интеллект — адамның интеллектуалдық әрекеттерін орындай алатын компьютерлік жүйелерді құрумен айналысатын информатика саласы. Мұндай жүйелер суреттерді тану, мәтінді талдау, сөйлеуді өңдеу және шешім қабылдау сияқты күрделі тапсырмаларды орындай алады.</w:t>
+      </w:r>
+    </w:p>
+    <w:p>
+      <w:pPr>
+        <w:jc w:val="both"/>
+        <w:rPr>
+          <w:sz w:val="28"/>
+          <w:szCs w:val="28"/>
+          <w:lang w:val="kk-KZ"/>
+        </w:rPr>
+      </w:pPr>
+      <w:r>
+        <w:rPr>
+          <w:sz w:val="28"/>
+          <w:szCs w:val="28"/>
+          <w:lang w:val="kk-KZ"/>
+        </w:rPr>
+        <w:t xml:space="preserve">Соңғы жылдары </w:t>
+      </w:r>
+      <w:proofErr w:type="spellStart"/>
+      <w:r>
+        <w:rPr>
+          <w:sz w:val="28"/>
+          <w:szCs w:val="28"/>
+          <w:lang w:val="kk-KZ"/>
+        </w:rPr>
+        <w:t>генеративті</w:t>
+      </w:r>
+      <w:proofErr w:type="spellEnd"/>
+      <w:r>
+        <w:rPr>
+          <w:sz w:val="28"/>
+          <w:szCs w:val="28"/>
+          <w:lang w:val="kk-KZ"/>
+        </w:rPr>
+        <w:t xml:space="preserve"> модельдер үлкен танымалдыққа ие болды. Бұл модельдер үлкен деректер жиынтығында оқытылып, жаңа контент жасай алады. Мысалы, </w:t>
+      </w:r>
+      <w:proofErr w:type="spellStart"/>
+      <w:r>
+        <w:rPr>
+          <w:sz w:val="28"/>
+          <w:szCs w:val="28"/>
+          <w:lang w:val="kk-KZ"/>
+        </w:rPr>
+        <w:t>генеративті</w:t>
+      </w:r>
+      <w:proofErr w:type="spellEnd"/>
+      <w:r>
+        <w:rPr>
+          <w:sz w:val="28"/>
+          <w:szCs w:val="28"/>
+          <w:lang w:val="kk-KZ"/>
+        </w:rPr>
+        <w:t xml:space="preserve"> модельдер мәтіндік сипаттама негізінде жаңа суреттер немесе бейнелер жасай алады.</w:t>
+      </w:r>
+    </w:p>
+    <w:p>
+      <w:pPr>
+        <w:jc w:val="both"/>
+        <w:rPr>
+          <w:sz w:val="28"/>
+          <w:szCs w:val="28"/>
+          <w:lang w:val="kk-KZ"/>
+        </w:rPr>
+      </w:pPr>
+      <w:r>
+        <w:rPr>
+          <w:sz w:val="28"/>
+          <w:szCs w:val="28"/>
+          <w:lang w:val="kk-KZ"/>
+        </w:rPr>
+        <w:t>Жасанды интеллект технологиялары медиа индустриясында кеңінен қолданылады. Автоматтандырудың арқасында контент жасау процесі әлдеқайда жылдам және тиімді болады.</w:t>
+      </w:r>
+    </w:p>
+    <w:p>
+      <w:pPr>
+        <w:jc w:val="both"/>
+        <w:rPr>
+          <w:sz w:val="28"/>
+          <w:szCs w:val="28"/>
+          <w:lang w:val="kk-KZ"/>
+        </w:rPr>
+      </w:pPr>
+      <w:r>
+        <w:rPr>
+          <w:sz w:val="28"/>
+          <w:szCs w:val="28"/>
+          <w:lang w:val="kk-KZ"/>
+        </w:rPr>
+        <w:t>1.2 Қолданыстағы шешімдерді талдау</w:t>
+      </w:r>
+    </w:p>
+    <w:p>
+      <w:pPr>
+        <w:jc w:val="both"/>
+        <w:rPr>
+          <w:sz w:val="28"/>
+          <w:szCs w:val="28"/>
+          <w:lang w:val="kk-KZ"/>
+        </w:rPr>
+      </w:pPr>
+      <w:r>
+        <w:rPr>
+          <w:sz w:val="28"/>
+          <w:szCs w:val="28"/>
+          <w:lang w:val="kk-KZ"/>
+        </w:rPr>
+        <w:t>Қазіргі уақытта жасанды интеллект негізінде жұмыс істейтін көптеген жүйелер бар. Олар сурет генерациясы, сөйлеуді синтездеу және бейне өңдеу сияқты қызметтерді ұсынады.</w:t>
+      </w:r>
+    </w:p>
+    <w:p>
+      <w:pPr>
+        <w:jc w:val="both"/>
+        <w:rPr>
+          <w:sz w:val="28"/>
+          <w:szCs w:val="28"/>
+          <w:lang w:val="kk-KZ"/>
+        </w:rPr>
+      </w:pPr>
+      <w:r>
+        <w:rPr>
+          <w:sz w:val="28"/>
+          <w:szCs w:val="28"/>
+          <w:lang w:val="kk-KZ"/>
+        </w:rPr>
+        <w:t>Бұл жүйелер көбінесе нейрондық желілерге негізделген. Олар үлкен деректер жиынтығында оқытылып, жаңа контент жасай алады. Мысалы, сурет генерациялау модельдері мәтін арқылы жаңа суреттер жасайды, ал сөйлеуді синтездеу жүйелері мәтінді дыбысқа айналдырады.</w:t>
+      </w:r>
+    </w:p>
+    <w:p>
+      <w:pPr>
+        <w:jc w:val="both"/>
+        <w:rPr>
+          <w:sz w:val="28"/>
+          <w:szCs w:val="28"/>
+          <w:lang w:val="kk-KZ"/>
+        </w:rPr>
+      </w:pPr>
+      <w:r>
+        <w:rPr>
+          <w:sz w:val="28"/>
+          <w:szCs w:val="28"/>
+          <w:lang w:val="kk-KZ"/>
+        </w:rPr>
+        <w:t>Сонымен қатар кейбір жүйелер бейнені автоматты түрде өңдей алады. Мысалы, бейнені кесу, монтаж жасау және эффектілер қосу сияқты функциялар орындалады.</w:t>
+      </w:r>
+    </w:p>
+    <w:p>
+      <w:pPr>
+        <w:jc w:val="both"/>
+        <w:rPr>
+          <w:sz w:val="28"/>
+          <w:szCs w:val="28"/>
+          <w:lang w:val="kk-KZ"/>
+        </w:rPr>
+      </w:pPr>
+      <w:r>
+        <w:rPr>
+          <w:sz w:val="28"/>
+          <w:szCs w:val="28"/>
+          <w:lang w:val="kk-KZ"/>
+        </w:rPr>
+        <w:t>1.3 Негізгі терминдер</w:t>
+      </w:r>
+    </w:p>
+    <w:p>
+      <w:pPr>
+        <w:jc w:val="both"/>
+        <w:rPr>
+          <w:sz w:val="28"/>
+          <w:szCs w:val="28"/>
+          <w:lang w:val="kk-KZ"/>
+        </w:rPr>
+      </w:pPr>
+      <w:proofErr w:type="spellStart"/>
+      <w:r>
+        <w:rPr>
+          <w:sz w:val="28"/>
+          <w:szCs w:val="28"/>
+          <w:lang w:val="kk-KZ"/>
+        </w:rPr>
+        <w:t>Artificial</w:t>
+      </w:r>
+      <w:proofErr w:type="spellEnd"/>
+      <w:r>
+        <w:rPr>
+          <w:sz w:val="28"/>
+          <w:szCs w:val="28"/>
+          <w:lang w:val="kk-KZ"/>
+        </w:rPr>
+        <w:t xml:space="preserve"> </w:t>
+      </w:r>
+      <w:proofErr w:type="spellStart"/>
+      <w:r>
+        <w:rPr>
+          <w:sz w:val="28"/>
+          <w:szCs w:val="28"/>
+          <w:lang w:val="kk-KZ"/>
+        </w:rPr>
+        <w:t>Intelligence</w:t>
+      </w:r>
+      <w:proofErr w:type="spellEnd"/>
+      <w:r>
+        <w:rPr>
+          <w:sz w:val="28"/>
+          <w:szCs w:val="28"/>
+          <w:lang w:val="kk-KZ"/>
+        </w:rPr>
+        <w:t xml:space="preserve"> — адамның интеллектуалдық әрекеттерін модельдейтін технологиялар.</w:t>
+      </w:r>
+    </w:p>
+    <w:p>
+      <w:pPr>
+        <w:jc w:val="both"/>
+        <w:rPr>
+          <w:sz w:val="28"/>
+          <w:szCs w:val="28"/>
+          <w:lang w:val="kk-KZ"/>
+        </w:rPr>
+      </w:pPr>
+      <w:proofErr w:type="spellStart"/>
+      <w:r>
+        <w:rPr>
+          <w:sz w:val="28"/>
+          <w:szCs w:val="28"/>
+          <w:lang w:val="kk-KZ"/>
+        </w:rPr>
+        <w:t>Machine</w:t>
+      </w:r>
+      <w:proofErr w:type="spellEnd"/>
+      <w:r>
+        <w:rPr>
+          <w:sz w:val="28"/>
+          <w:szCs w:val="28"/>
+          <w:lang w:val="kk-KZ"/>
+        </w:rPr>
+        <w:t xml:space="preserve"> </w:t>
+      </w:r>
+      <w:proofErr w:type="spellStart"/>
+      <w:r>
+        <w:rPr>
+          <w:sz w:val="28"/>
+          <w:szCs w:val="28"/>
+          <w:lang w:val="kk-KZ"/>
+        </w:rPr>
+        <w:t>Learning</w:t>
+      </w:r>
+      <w:proofErr w:type="spellEnd"/>
+      <w:r>
+        <w:rPr>
+          <w:sz w:val="28"/>
+          <w:szCs w:val="28"/>
+          <w:lang w:val="kk-KZ"/>
+        </w:rPr>
+        <w:t xml:space="preserve"> — деректер негізінде алгоритмдерді үйрету әдісі.</w:t>
+      </w:r>
+    </w:p>
+    <w:p>
+      <w:pPr>
+        <w:jc w:val="both"/>
+        <w:rPr>
+          <w:sz w:val="28"/>
+          <w:szCs w:val="28"/>
+          <w:lang w:val="kk-KZ"/>
+        </w:rPr>
+      </w:pPr>
+      <w:proofErr w:type="spellStart"/>
+      <w:r>
+        <w:rPr>
+          <w:sz w:val="28"/>
+          <w:szCs w:val="28"/>
+          <w:lang w:val="kk-KZ"/>
+        </w:rPr>
+        <w:t>Neural</w:t>
+      </w:r>
+      <w:proofErr w:type="spellEnd"/>
+      <w:r>
+        <w:rPr>
+          <w:sz w:val="28"/>
+          <w:szCs w:val="28"/>
+          <w:lang w:val="kk-KZ"/>
+        </w:rPr>
+        <w:t xml:space="preserve"> </w:t>
+      </w:r>
+      <w:proofErr w:type="spellStart"/>
+      <w:r>
+        <w:rPr>
+          <w:sz w:val="28"/>
+          <w:szCs w:val="28"/>
+          <w:lang w:val="kk-KZ"/>
+        </w:rPr>
+        <w:t>Network</w:t>
+      </w:r>
+      <w:proofErr w:type="spellEnd"/>
+      <w:r>
+        <w:rPr>
+          <w:sz w:val="28"/>
+          <w:szCs w:val="28"/>
+          <w:lang w:val="kk-KZ"/>
+        </w:rPr>
+        <w:t xml:space="preserve"> — адам миының жұмыс принципіне ұқсас есептеу моделі.</w:t>
+      </w:r>
+    </w:p>
+    <w:p>
+      <w:pPr>
+        <w:jc w:val="both"/>
+        <w:rPr>
+          <w:sz w:val="28"/>
+          <w:szCs w:val="28"/>
+          <w:lang w:val="kk-KZ"/>
+        </w:rPr>
+      </w:pPr>
+      <w:proofErr w:type="spellStart"/>
+      <w:r>
+        <w:rPr>
+          <w:sz w:val="28"/>
+          <w:szCs w:val="28"/>
+          <w:lang w:val="kk-KZ"/>
+        </w:rPr>
+        <w:t>Text-to-Speech</w:t>
+      </w:r>
+      <w:proofErr w:type="spellEnd"/>
+      <w:r>
+        <w:rPr>
+          <w:sz w:val="28"/>
+          <w:szCs w:val="28"/>
+          <w:lang w:val="kk-KZ"/>
+        </w:rPr>
+        <w:t xml:space="preserve"> — мәтінді дыбысқа айналдыру технологиясы.</w:t>
+      </w:r>
+    </w:p>
+    <w:p>
+      <w:pPr>
+        <w:jc w:val="both"/>
+        <w:rPr>
+          <w:sz w:val="28"/>
+          <w:szCs w:val="28"/>
+          <w:lang w:val="kk-KZ"/>
+        </w:rPr>
+      </w:pPr>
+      <w:proofErr w:type="spellStart"/>
+      <w:r>
+        <w:rPr>
+          <w:sz w:val="28"/>
+          <w:szCs w:val="28"/>
+          <w:lang w:val="kk-KZ"/>
+        </w:rPr>
+        <w:t>Computer</w:t>
+      </w:r>
+      <w:proofErr w:type="spellEnd"/>
+      <w:r>
+        <w:rPr>
+          <w:sz w:val="28"/>
+          <w:szCs w:val="28"/>
+          <w:lang w:val="kk-KZ"/>
+        </w:rPr>
+        <w:t xml:space="preserve"> </w:t>
+      </w:r>
+      <w:proofErr w:type="spellStart"/>
+      <w:r>
+        <w:rPr>
+          <w:sz w:val="28"/>
+          <w:szCs w:val="28"/>
+          <w:lang w:val="kk-KZ"/>
+        </w:rPr>
+        <w:t>Vision</w:t>
+      </w:r>
+      <w:proofErr w:type="spellEnd"/>
+      <w:r>
+        <w:rPr>
+          <w:sz w:val="28"/>
+          <w:szCs w:val="28"/>
+          <w:lang w:val="kk-KZ"/>
+        </w:rPr>
+        <w:t xml:space="preserve"> — суреттер мен бейнелерді талдау технологиясы.</w:t>
+      </w:r>
+    </w:p>
+    <w:p>
+      <w:pPr>
+        <w:jc w:val="both"/>
+        <w:rPr>
+          <w:sz w:val="28"/>
+          <w:szCs w:val="28"/>
+          <w:lang w:val="kk-KZ"/>
+        </w:rPr>
+      </w:pPr>
+      <w:proofErr w:type="spellStart"/>
+      <w:r>
+        <w:rPr>
+          <w:sz w:val="28"/>
+          <w:szCs w:val="28"/>
+          <w:lang w:val="kk-KZ"/>
+        </w:rPr>
+        <w:t>Deep</w:t>
+      </w:r>
+      <w:proofErr w:type="spellEnd"/>
+      <w:r>
+        <w:rPr>
+          <w:sz w:val="28"/>
+          <w:szCs w:val="28"/>
+          <w:lang w:val="kk-KZ"/>
+        </w:rPr>
+        <w:t xml:space="preserve"> </w:t>
+      </w:r>
+      <w:proofErr w:type="spellStart"/>
+      <w:r>
+        <w:rPr>
+          <w:sz w:val="28"/>
+          <w:szCs w:val="28"/>
+          <w:lang w:val="kk-KZ"/>
+        </w:rPr>
+        <w:t>Learning</w:t>
+      </w:r>
+      <w:proofErr w:type="spellEnd"/>
+      <w:r>
+        <w:rPr>
+          <w:sz w:val="28"/>
+          <w:szCs w:val="28"/>
+          <w:lang w:val="kk-KZ"/>
+        </w:rPr>
+        <w:t xml:space="preserve"> — көпқабатты нейрондық желілерді қолданатын машиналық оқыту әдісі.</w:t>
+      </w:r>
+    </w:p>
+    <w:p>
+      <w:pPr>
+        <w:jc w:val="both"/>
+        <w:rPr>
+          <w:sz w:val="28"/>
+          <w:szCs w:val="28"/>
+          <w:lang w:val="kk-KZ"/>
+        </w:rPr>
+      </w:pPr>
+      <w:proofErr w:type="spellStart"/>
+      <w:r>
+        <w:rPr>
+          <w:sz w:val="28"/>
+          <w:szCs w:val="28"/>
+          <w:lang w:val="kk-KZ"/>
+        </w:rPr>
+        <w:t>Automation</w:t>
+      </w:r>
+      <w:proofErr w:type="spellEnd"/>
+      <w:r>
+        <w:rPr>
+          <w:sz w:val="28"/>
+          <w:szCs w:val="28"/>
+          <w:lang w:val="kk-KZ"/>
+        </w:rPr>
+        <w:t xml:space="preserve"> — процестерді автоматтандыру.</w:t>
+      </w:r>
+    </w:p>
+    <w:p>
+      <w:pPr>
+        <w:jc w:val="both"/>
+        <w:rPr>
+          <w:sz w:val="28"/>
+          <w:szCs w:val="28"/>
+          <w:lang w:val="kk-KZ"/>
+        </w:rPr>
+      </w:pPr>
+      <w:proofErr w:type="spellStart"/>
+      <w:r>
+        <w:rPr>
+          <w:sz w:val="28"/>
+          <w:szCs w:val="28"/>
+          <w:lang w:val="kk-KZ"/>
+        </w:rPr>
+        <w:t>Content</w:t>
+      </w:r>
+      <w:proofErr w:type="spellEnd"/>
+      <w:r>
+        <w:rPr>
+          <w:sz w:val="28"/>
+          <w:szCs w:val="28"/>
+          <w:lang w:val="kk-KZ"/>
+        </w:rPr>
+        <w:t xml:space="preserve"> </w:t>
+      </w:r>
+      <w:proofErr w:type="spellStart"/>
+      <w:r>
+        <w:rPr>
+          <w:sz w:val="28"/>
+          <w:szCs w:val="28"/>
+          <w:lang w:val="kk-KZ"/>
+        </w:rPr>
+        <w:t>Generation</w:t>
+      </w:r>
+      <w:proofErr w:type="spellEnd"/>
+      <w:r>
+        <w:rPr>
+          <w:sz w:val="28"/>
+          <w:szCs w:val="28"/>
+          <w:lang w:val="kk-KZ"/>
+        </w:rPr>
+        <w:t xml:space="preserve"> — контентті автоматты түрде жасау.</w:t>
+      </w:r>
+    </w:p>
+    <w:p>
+      <w:pPr>
+        <w:jc w:val="both"/>
+        <w:rPr>
+          <w:sz w:val="28"/>
+          <w:szCs w:val="28"/>
+          <w:lang w:val="kk-KZ"/>
+        </w:rPr>
+      </w:pPr>
+      <w:proofErr w:type="spellStart"/>
+      <w:r>
+        <w:rPr>
+          <w:sz w:val="28"/>
+          <w:szCs w:val="28"/>
+          <w:lang w:val="kk-KZ"/>
+        </w:rPr>
+        <w:t>Media</w:t>
+      </w:r>
+      <w:proofErr w:type="spellEnd"/>
+      <w:r>
+        <w:rPr>
+          <w:sz w:val="28"/>
+          <w:szCs w:val="28"/>
+          <w:lang w:val="kk-KZ"/>
+        </w:rPr>
+        <w:t xml:space="preserve"> </w:t>
+      </w:r>
+      <w:proofErr w:type="spellStart"/>
+      <w:r>
+        <w:rPr>
+          <w:sz w:val="28"/>
+          <w:szCs w:val="28"/>
+          <w:lang w:val="kk-KZ"/>
+        </w:rPr>
+        <w:t>Processing</w:t>
+      </w:r>
+      <w:proofErr w:type="spellEnd"/>
+      <w:r>
+        <w:rPr>
+          <w:sz w:val="28"/>
+          <w:szCs w:val="28"/>
+          <w:lang w:val="kk-KZ"/>
+        </w:rPr>
+        <w:t xml:space="preserve"> — мультимедиялық деректерді өңдеу.</w:t>
+      </w:r>
+    </w:p>
+    <w:p>
+      <w:pPr>
+        <w:jc w:val="both"/>
+        <w:rPr>
+          <w:sz w:val="28"/>
+          <w:szCs w:val="28"/>
+          <w:lang w:val="kk-KZ"/>
+        </w:rPr>
+      </w:pPr>
+      <w:proofErr w:type="spellStart"/>
+      <w:r>
+        <w:rPr>
+          <w:sz w:val="28"/>
+          <w:szCs w:val="28"/>
+          <w:lang w:val="kk-KZ"/>
+        </w:rPr>
+        <w:t>Data</w:t>
+      </w:r>
+      <w:proofErr w:type="spellEnd"/>
+      <w:r>
+        <w:rPr>
+          <w:sz w:val="28"/>
+          <w:szCs w:val="28"/>
+          <w:lang w:val="kk-KZ"/>
+        </w:rPr>
+        <w:t xml:space="preserve"> </w:t>
+      </w:r>
+      <w:proofErr w:type="spellStart"/>
+      <w:r>
+        <w:rPr>
+          <w:sz w:val="28"/>
+          <w:szCs w:val="28"/>
+          <w:lang w:val="kk-KZ"/>
+        </w:rPr>
+        <w:t>Analysis</w:t>
+      </w:r>
+      <w:proofErr w:type="spellEnd"/>
+      <w:r>
+        <w:rPr>
+          <w:sz w:val="28"/>
+          <w:szCs w:val="28"/>
+          <w:lang w:val="kk-KZ"/>
+        </w:rPr>
+        <w:t xml:space="preserve"> — деректерді талдау.</w:t>
+      </w:r>
     </w:p>
     <w:p>
       <w:pPr>

</xml_diff>

<commit_message>
Added system architecture and modules
Added system architecture and modules
</commit_message>
<xml_diff>
--- a/РТД модуль 1.docx
+++ b/РТД модуль 1.docx
@@ -2898,6 +2898,748 @@
         <w:t xml:space="preserve"> — деректерді талдау.</w:t>
       </w:r>
     </w:p>
+    <w:p>
+      <w:pPr>
+        <w:jc w:val="both"/>
+        <w:rPr>
+          <w:sz w:val="28"/>
+          <w:szCs w:val="28"/>
+          <w:lang w:val="kk-KZ"/>
+        </w:rPr>
+      </w:pPr>
+    </w:p>
+    <w:p>
+      <w:pPr>
+        <w:jc w:val="both"/>
+        <w:rPr>
+          <w:sz w:val="28"/>
+          <w:szCs w:val="28"/>
+          <w:lang w:val="kk-KZ"/>
+        </w:rPr>
+      </w:pPr>
+      <w:r>
+        <w:rPr>
+          <w:b/>
+          <w:bCs/>
+          <w:sz w:val="28"/>
+          <w:szCs w:val="28"/>
+          <w:lang w:val="kk-KZ"/>
+        </w:rPr>
+        <w:t>2-Тарау</w:t>
+      </w:r>
+      <w:r>
+        <w:rPr>
+          <w:sz w:val="28"/>
+          <w:szCs w:val="28"/>
+          <w:lang w:val="kk-KZ"/>
+        </w:rPr>
+        <w:t>. AI-қосымшасын жобалау</w:t>
+      </w:r>
+    </w:p>
+    <w:p>
+      <w:pPr>
+        <w:jc w:val="both"/>
+        <w:rPr>
+          <w:sz w:val="28"/>
+          <w:szCs w:val="28"/>
+          <w:lang w:val="kk-KZ"/>
+        </w:rPr>
+      </w:pPr>
+      <w:r>
+        <w:rPr>
+          <w:sz w:val="28"/>
+          <w:szCs w:val="28"/>
+          <w:lang w:val="kk-KZ"/>
+        </w:rPr>
+        <w:t>Жобаланатын қосымша мультимедиялық контентті автоматты түрде жасауға арналған. Пайдаланушы мәтін енгізеді, ал жүйе сол мәтін негізінде сурет, дыбыс немесе бейне жасай алады.</w:t>
+      </w:r>
+    </w:p>
+    <w:p>
+      <w:pPr>
+        <w:jc w:val="both"/>
+        <w:rPr>
+          <w:sz w:val="28"/>
+          <w:szCs w:val="28"/>
+          <w:lang w:val="kk-KZ"/>
+        </w:rPr>
+      </w:pPr>
+      <w:r>
+        <w:rPr>
+          <w:sz w:val="28"/>
+          <w:szCs w:val="28"/>
+          <w:lang w:val="kk-KZ"/>
+        </w:rPr>
+        <w:t>Жүйенің негізгі функциялары:</w:t>
+      </w:r>
+    </w:p>
+    <w:p>
+      <w:pPr>
+        <w:jc w:val="both"/>
+        <w:rPr>
+          <w:sz w:val="28"/>
+          <w:szCs w:val="28"/>
+          <w:lang w:val="kk-KZ"/>
+        </w:rPr>
+      </w:pPr>
+      <w:r>
+        <w:rPr>
+          <w:sz w:val="28"/>
+          <w:szCs w:val="28"/>
+          <w:lang w:val="kk-KZ"/>
+        </w:rPr>
+        <w:t>• мәтін негізінде сурет генерациясы</w:t>
+      </w:r>
+    </w:p>
+    <w:p>
+      <w:pPr>
+        <w:jc w:val="both"/>
+        <w:rPr>
+          <w:sz w:val="28"/>
+          <w:szCs w:val="28"/>
+          <w:lang w:val="kk-KZ"/>
+        </w:rPr>
+      </w:pPr>
+      <w:r>
+        <w:rPr>
+          <w:sz w:val="28"/>
+          <w:szCs w:val="28"/>
+          <w:lang w:val="kk-KZ"/>
+        </w:rPr>
+        <w:t>• мәтінді дыбыстау</w:t>
+      </w:r>
+    </w:p>
+    <w:p>
+      <w:pPr>
+        <w:jc w:val="both"/>
+        <w:rPr>
+          <w:sz w:val="28"/>
+          <w:szCs w:val="28"/>
+          <w:lang w:val="kk-KZ"/>
+        </w:rPr>
+      </w:pPr>
+      <w:r>
+        <w:rPr>
+          <w:sz w:val="28"/>
+          <w:szCs w:val="28"/>
+          <w:lang w:val="kk-KZ"/>
+        </w:rPr>
+        <w:t>• бейне генерациясы</w:t>
+      </w:r>
+    </w:p>
+    <w:p>
+      <w:pPr>
+        <w:jc w:val="both"/>
+        <w:rPr>
+          <w:sz w:val="28"/>
+          <w:szCs w:val="28"/>
+          <w:lang w:val="kk-KZ"/>
+        </w:rPr>
+      </w:pPr>
+      <w:r>
+        <w:rPr>
+          <w:sz w:val="28"/>
+          <w:szCs w:val="28"/>
+          <w:lang w:val="kk-KZ"/>
+        </w:rPr>
+        <w:t>• бейнені автоматты кесу</w:t>
+      </w:r>
+    </w:p>
+    <w:p>
+      <w:pPr>
+        <w:jc w:val="both"/>
+        <w:rPr>
+          <w:sz w:val="28"/>
+          <w:szCs w:val="28"/>
+          <w:lang w:val="kk-KZ"/>
+        </w:rPr>
+      </w:pPr>
+      <w:r>
+        <w:rPr>
+          <w:sz w:val="28"/>
+          <w:szCs w:val="28"/>
+          <w:lang w:val="kk-KZ"/>
+        </w:rPr>
+        <w:t xml:space="preserve">• бейнені </w:t>
+      </w:r>
+      <w:proofErr w:type="spellStart"/>
+      <w:r>
+        <w:rPr>
+          <w:sz w:val="28"/>
+          <w:szCs w:val="28"/>
+          <w:lang w:val="kk-KZ"/>
+        </w:rPr>
+        <w:t>уникализациялау</w:t>
+      </w:r>
+      <w:proofErr w:type="spellEnd"/>
+    </w:p>
+    <w:p>
+      <w:pPr>
+        <w:jc w:val="both"/>
+        <w:rPr>
+          <w:sz w:val="28"/>
+          <w:szCs w:val="28"/>
+          <w:lang w:val="kk-KZ"/>
+        </w:rPr>
+      </w:pPr>
+      <w:r>
+        <w:rPr>
+          <w:sz w:val="28"/>
+          <w:szCs w:val="28"/>
+          <w:lang w:val="kk-KZ"/>
+        </w:rPr>
+        <w:t>Жүйе бірнеше модульден тұрады. Әр модуль белгілі бір функцияны орындайды.</w:t>
+      </w:r>
+    </w:p>
+    <w:p>
+      <w:pPr>
+        <w:jc w:val="both"/>
+        <w:rPr>
+          <w:sz w:val="28"/>
+          <w:szCs w:val="28"/>
+          <w:lang w:val="kk-KZ"/>
+        </w:rPr>
+      </w:pPr>
+      <w:r>
+        <w:rPr>
+          <w:sz w:val="28"/>
+          <w:szCs w:val="28"/>
+          <w:lang w:val="kk-KZ"/>
+        </w:rPr>
+        <w:t>Жүйе архитектурасы</w:t>
+      </w:r>
+    </w:p>
+    <w:p>
+      <w:pPr>
+        <w:jc w:val="both"/>
+        <w:rPr>
+          <w:sz w:val="28"/>
+          <w:szCs w:val="28"/>
+          <w:lang w:val="kk-KZ"/>
+        </w:rPr>
+      </w:pPr>
+    </w:p>
+    <w:p>
+      <w:pPr>
+        <w:jc w:val="both"/>
+        <w:rPr>
+          <w:b/>
+          <w:bCs/>
+          <w:sz w:val="28"/>
+          <w:szCs w:val="28"/>
+          <w:lang w:val="kk-KZ"/>
+        </w:rPr>
+      </w:pPr>
+      <w:r>
+        <w:rPr>
+          <w:b/>
+          <w:bCs/>
+          <w:sz w:val="28"/>
+          <w:szCs w:val="28"/>
+          <w:lang w:val="kk-KZ"/>
+        </w:rPr>
+        <w:t>AI жүйесінің архитектура диаграммасы:</w:t>
+      </w:r>
+    </w:p>
+    <w:p>
+      <w:pPr>
+        <w:jc w:val="both"/>
+        <w:rPr>
+          <w:sz w:val="28"/>
+          <w:szCs w:val="28"/>
+          <w:lang w:val="kk-KZ"/>
+        </w:rPr>
+      </w:pPr>
+      <w:r>
+        <w:rPr>
+          <w:sz w:val="28"/>
+          <w:szCs w:val="28"/>
+          <w:lang w:val="kk-KZ"/>
+        </w:rPr>
+        <w:t xml:space="preserve"> </w:t>
+      </w:r>
+      <w:r>
+        <w:rPr>
+          <w:noProof/>
+          <w:sz w:val="28"/>
+          <w:szCs w:val="28"/>
+          <w:lang w:val="kk-KZ"/>
+        </w:rPr>
+        <w:drawing>
+          <wp:inline distT="0" distB="0" distL="0" distR="0" wp14:anchorId="2697BABE" wp14:editId="45A852E3">
+            <wp:extent cx="5390866" cy="3234520"/>
+            <wp:effectExtent l="0" t="0" r="635" b="4445"/>
+            <wp:docPr id="1663136883" name="Рисунок 1"/>
+            <wp:cNvGraphicFramePr>
+              <a:graphicFrameLocks xmlns:a="http://schemas.openxmlformats.org/drawingml/2006/main" noChangeAspect="1"/>
+            </wp:cNvGraphicFramePr>
+            <a:graphic xmlns:a="http://schemas.openxmlformats.org/drawingml/2006/main">
+              <a:graphicData uri="http://schemas.openxmlformats.org/drawingml/2006/picture">
+                <pic:pic xmlns:pic="http://schemas.openxmlformats.org/drawingml/2006/picture">
+                  <pic:nvPicPr>
+                    <pic:cNvPr id="1663136883" name=""/>
+                    <pic:cNvPicPr/>
+                  </pic:nvPicPr>
+                  <pic:blipFill>
+                    <a:blip r:embed="rId9"/>
+                    <a:stretch>
+                      <a:fillRect/>
+                    </a:stretch>
+                  </pic:blipFill>
+                  <pic:spPr>
+                    <a:xfrm>
+                      <a:off x="0" y="0"/>
+                      <a:ext cx="5405871" cy="3243523"/>
+                    </a:xfrm>
+                    <a:prstGeom prst="rect">
+                      <a:avLst/>
+                    </a:prstGeom>
+                  </pic:spPr>
+                </pic:pic>
+              </a:graphicData>
+            </a:graphic>
+          </wp:inline>
+        </w:drawing>
+      </w:r>
+    </w:p>
+    <w:p>
+      <w:pPr>
+        <w:jc w:val="both"/>
+        <w:rPr>
+          <w:b/>
+          <w:bCs/>
+          <w:sz w:val="28"/>
+          <w:szCs w:val="28"/>
+          <w:lang w:val="kk-KZ"/>
+        </w:rPr>
+      </w:pPr>
+      <w:r>
+        <w:rPr>
+          <w:b/>
+          <w:bCs/>
+          <w:sz w:val="28"/>
+          <w:szCs w:val="28"/>
+          <w:lang w:val="kk-KZ"/>
+        </w:rPr>
+        <w:t>Функционалдық модульдер</w:t>
+      </w:r>
+    </w:p>
+    <w:tbl>
+      <w:tblPr>
+        <w:tblStyle w:val="ac"/>
+        <w:tblW w:w="0" w:type="auto"/>
+        <w:tblLook w:val="04A0" w:firstRow="1" w:lastRow="0" w:firstColumn="1" w:lastColumn="0" w:noHBand="0" w:noVBand="1"/>
+      </w:tblPr>
+      <w:tblGrid>
+        <w:gridCol w:w="4672"/>
+        <w:gridCol w:w="4673"/>
+      </w:tblGrid>
+      <w:tr>
+        <w:tc>
+          <w:tcPr>
+            <w:tcW w:w="4672" w:type="dxa"/>
+          </w:tcPr>
+          <w:p>
+            <w:pPr>
+              <w:jc w:val="both"/>
+              <w:rPr>
+                <w:sz w:val="28"/>
+                <w:szCs w:val="28"/>
+                <w:lang w:val="kk-KZ"/>
+              </w:rPr>
+            </w:pPr>
+            <w:r>
+              <w:rPr>
+                <w:sz w:val="28"/>
+                <w:szCs w:val="28"/>
+                <w:lang w:val="kk-KZ"/>
+              </w:rPr>
+              <w:t>Модуль</w:t>
+            </w:r>
+          </w:p>
+        </w:tc>
+        <w:tc>
+          <w:tcPr>
+            <w:tcW w:w="4673" w:type="dxa"/>
+          </w:tcPr>
+          <w:p>
+            <w:pPr>
+              <w:jc w:val="both"/>
+              <w:rPr>
+                <w:sz w:val="28"/>
+                <w:szCs w:val="28"/>
+                <w:lang w:val="kk-KZ"/>
+              </w:rPr>
+            </w:pPr>
+            <w:r>
+              <w:rPr>
+                <w:sz w:val="28"/>
+                <w:szCs w:val="28"/>
+                <w:lang w:val="kk-KZ"/>
+              </w:rPr>
+              <w:t>Сипаттамасы</w:t>
+            </w:r>
+          </w:p>
+        </w:tc>
+      </w:tr>
+      <w:tr>
+        <w:tc>
+          <w:tcPr>
+            <w:tcW w:w="4672" w:type="dxa"/>
+          </w:tcPr>
+          <w:p>
+            <w:pPr>
+              <w:jc w:val="both"/>
+              <w:rPr>
+                <w:sz w:val="28"/>
+                <w:szCs w:val="28"/>
+                <w:lang w:val="kk-KZ"/>
+              </w:rPr>
+            </w:pPr>
+            <w:proofErr w:type="spellStart"/>
+            <w:r>
+              <w:rPr>
+                <w:sz w:val="28"/>
+                <w:szCs w:val="28"/>
+                <w:lang w:val="kk-KZ"/>
+              </w:rPr>
+              <w:t>Text</w:t>
+            </w:r>
+            <w:proofErr w:type="spellEnd"/>
+            <w:r>
+              <w:rPr>
+                <w:sz w:val="28"/>
+                <w:szCs w:val="28"/>
+                <w:lang w:val="kk-KZ"/>
+              </w:rPr>
+              <w:t xml:space="preserve"> </w:t>
+            </w:r>
+            <w:proofErr w:type="spellStart"/>
+            <w:r>
+              <w:rPr>
+                <w:sz w:val="28"/>
+                <w:szCs w:val="28"/>
+                <w:lang w:val="kk-KZ"/>
+              </w:rPr>
+              <w:t>Processing</w:t>
+            </w:r>
+            <w:proofErr w:type="spellEnd"/>
+          </w:p>
+        </w:tc>
+        <w:tc>
+          <w:tcPr>
+            <w:tcW w:w="4673" w:type="dxa"/>
+          </w:tcPr>
+          <w:p>
+            <w:pPr>
+              <w:jc w:val="both"/>
+              <w:rPr>
+                <w:sz w:val="28"/>
+                <w:szCs w:val="28"/>
+                <w:lang w:val="kk-KZ"/>
+              </w:rPr>
+            </w:pPr>
+            <w:r>
+              <w:rPr>
+                <w:sz w:val="28"/>
+                <w:szCs w:val="28"/>
+                <w:lang w:val="kk-KZ"/>
+              </w:rPr>
+              <w:t>пайдаланушы мәтінін өңдеу</w:t>
+            </w:r>
+          </w:p>
+        </w:tc>
+      </w:tr>
+      <w:tr>
+        <w:tc>
+          <w:tcPr>
+            <w:tcW w:w="4672" w:type="dxa"/>
+          </w:tcPr>
+          <w:p>
+            <w:pPr>
+              <w:jc w:val="both"/>
+              <w:rPr>
+                <w:sz w:val="28"/>
+                <w:szCs w:val="28"/>
+                <w:lang w:val="kk-KZ"/>
+              </w:rPr>
+            </w:pPr>
+            <w:proofErr w:type="spellStart"/>
+            <w:r>
+              <w:rPr>
+                <w:sz w:val="28"/>
+                <w:szCs w:val="28"/>
+                <w:lang w:val="kk-KZ"/>
+              </w:rPr>
+              <w:t>Image</w:t>
+            </w:r>
+            <w:proofErr w:type="spellEnd"/>
+            <w:r>
+              <w:rPr>
+                <w:sz w:val="28"/>
+                <w:szCs w:val="28"/>
+                <w:lang w:val="kk-KZ"/>
+              </w:rPr>
+              <w:t xml:space="preserve"> </w:t>
+            </w:r>
+            <w:proofErr w:type="spellStart"/>
+            <w:r>
+              <w:rPr>
+                <w:sz w:val="28"/>
+                <w:szCs w:val="28"/>
+                <w:lang w:val="kk-KZ"/>
+              </w:rPr>
+              <w:t>Generation</w:t>
+            </w:r>
+            <w:proofErr w:type="spellEnd"/>
+          </w:p>
+        </w:tc>
+        <w:tc>
+          <w:tcPr>
+            <w:tcW w:w="4673" w:type="dxa"/>
+          </w:tcPr>
+          <w:p>
+            <w:pPr>
+              <w:jc w:val="both"/>
+              <w:rPr>
+                <w:sz w:val="28"/>
+                <w:szCs w:val="28"/>
+                <w:lang w:val="kk-KZ"/>
+              </w:rPr>
+            </w:pPr>
+            <w:r>
+              <w:rPr>
+                <w:sz w:val="28"/>
+                <w:szCs w:val="28"/>
+                <w:lang w:val="kk-KZ"/>
+              </w:rPr>
+              <w:t>AI арқылы сурет жасау</w:t>
+            </w:r>
+          </w:p>
+        </w:tc>
+      </w:tr>
+      <w:tr>
+        <w:tc>
+          <w:tcPr>
+            <w:tcW w:w="4672" w:type="dxa"/>
+          </w:tcPr>
+          <w:p>
+            <w:pPr>
+              <w:jc w:val="both"/>
+              <w:rPr>
+                <w:sz w:val="28"/>
+                <w:szCs w:val="28"/>
+                <w:lang w:val="kk-KZ"/>
+              </w:rPr>
+            </w:pPr>
+            <w:proofErr w:type="spellStart"/>
+            <w:r>
+              <w:rPr>
+                <w:sz w:val="28"/>
+                <w:szCs w:val="28"/>
+                <w:lang w:val="kk-KZ"/>
+              </w:rPr>
+              <w:t>Voice</w:t>
+            </w:r>
+            <w:proofErr w:type="spellEnd"/>
+            <w:r>
+              <w:rPr>
+                <w:sz w:val="28"/>
+                <w:szCs w:val="28"/>
+                <w:lang w:val="kk-KZ"/>
+              </w:rPr>
+              <w:t xml:space="preserve"> </w:t>
+            </w:r>
+            <w:proofErr w:type="spellStart"/>
+            <w:r>
+              <w:rPr>
+                <w:sz w:val="28"/>
+                <w:szCs w:val="28"/>
+                <w:lang w:val="kk-KZ"/>
+              </w:rPr>
+              <w:t>Generation</w:t>
+            </w:r>
+            <w:proofErr w:type="spellEnd"/>
+          </w:p>
+        </w:tc>
+        <w:tc>
+          <w:tcPr>
+            <w:tcW w:w="4673" w:type="dxa"/>
+          </w:tcPr>
+          <w:p>
+            <w:pPr>
+              <w:jc w:val="both"/>
+              <w:rPr>
+                <w:sz w:val="28"/>
+                <w:szCs w:val="28"/>
+                <w:lang w:val="kk-KZ"/>
+              </w:rPr>
+            </w:pPr>
+            <w:r>
+              <w:rPr>
+                <w:sz w:val="28"/>
+                <w:szCs w:val="28"/>
+                <w:lang w:val="kk-KZ"/>
+              </w:rPr>
+              <w:t>мәтінді дыбыстау</w:t>
+            </w:r>
+          </w:p>
+        </w:tc>
+      </w:tr>
+      <w:tr>
+        <w:tc>
+          <w:tcPr>
+            <w:tcW w:w="4672" w:type="dxa"/>
+          </w:tcPr>
+          <w:p>
+            <w:pPr>
+              <w:jc w:val="both"/>
+              <w:rPr>
+                <w:sz w:val="28"/>
+                <w:szCs w:val="28"/>
+                <w:lang w:val="kk-KZ"/>
+              </w:rPr>
+            </w:pPr>
+            <w:proofErr w:type="spellStart"/>
+            <w:r>
+              <w:rPr>
+                <w:sz w:val="28"/>
+                <w:szCs w:val="28"/>
+                <w:lang w:val="kk-KZ"/>
+              </w:rPr>
+              <w:t>Video</w:t>
+            </w:r>
+            <w:proofErr w:type="spellEnd"/>
+            <w:r>
+              <w:rPr>
+                <w:sz w:val="28"/>
+                <w:szCs w:val="28"/>
+                <w:lang w:val="kk-KZ"/>
+              </w:rPr>
+              <w:t xml:space="preserve"> </w:t>
+            </w:r>
+            <w:proofErr w:type="spellStart"/>
+            <w:r>
+              <w:rPr>
+                <w:sz w:val="28"/>
+                <w:szCs w:val="28"/>
+                <w:lang w:val="kk-KZ"/>
+              </w:rPr>
+              <w:t>Generation</w:t>
+            </w:r>
+            <w:proofErr w:type="spellEnd"/>
+          </w:p>
+        </w:tc>
+        <w:tc>
+          <w:tcPr>
+            <w:tcW w:w="4673" w:type="dxa"/>
+          </w:tcPr>
+          <w:p>
+            <w:pPr>
+              <w:jc w:val="both"/>
+              <w:rPr>
+                <w:sz w:val="28"/>
+                <w:szCs w:val="28"/>
+                <w:lang w:val="kk-KZ"/>
+              </w:rPr>
+            </w:pPr>
+            <w:r>
+              <w:rPr>
+                <w:sz w:val="28"/>
+                <w:szCs w:val="28"/>
+                <w:lang w:val="kk-KZ"/>
+              </w:rPr>
+              <w:t>бейне генерациялау</w:t>
+            </w:r>
+          </w:p>
+        </w:tc>
+      </w:tr>
+      <w:tr>
+        <w:tc>
+          <w:tcPr>
+            <w:tcW w:w="4672" w:type="dxa"/>
+          </w:tcPr>
+          <w:p>
+            <w:pPr>
+              <w:jc w:val="both"/>
+              <w:rPr>
+                <w:sz w:val="28"/>
+                <w:szCs w:val="28"/>
+                <w:lang w:val="kk-KZ"/>
+              </w:rPr>
+            </w:pPr>
+            <w:proofErr w:type="spellStart"/>
+            <w:r>
+              <w:rPr>
+                <w:sz w:val="28"/>
+                <w:szCs w:val="28"/>
+                <w:lang w:val="kk-KZ"/>
+              </w:rPr>
+              <w:t>Video</w:t>
+            </w:r>
+            <w:proofErr w:type="spellEnd"/>
+            <w:r>
+              <w:rPr>
+                <w:sz w:val="28"/>
+                <w:szCs w:val="28"/>
+                <w:lang w:val="kk-KZ"/>
+              </w:rPr>
+              <w:t xml:space="preserve"> </w:t>
+            </w:r>
+            <w:proofErr w:type="spellStart"/>
+            <w:r>
+              <w:rPr>
+                <w:sz w:val="28"/>
+                <w:szCs w:val="28"/>
+                <w:lang w:val="kk-KZ"/>
+              </w:rPr>
+              <w:t>Optimization</w:t>
+            </w:r>
+            <w:proofErr w:type="spellEnd"/>
+          </w:p>
+        </w:tc>
+        <w:tc>
+          <w:tcPr>
+            <w:tcW w:w="4673" w:type="dxa"/>
+          </w:tcPr>
+          <w:p>
+            <w:pPr>
+              <w:jc w:val="both"/>
+              <w:rPr>
+                <w:sz w:val="28"/>
+                <w:szCs w:val="28"/>
+                <w:lang w:val="kk-KZ"/>
+              </w:rPr>
+            </w:pPr>
+            <w:r>
+              <w:rPr>
+                <w:sz w:val="28"/>
+                <w:szCs w:val="28"/>
+                <w:lang w:val="kk-KZ"/>
+              </w:rPr>
+              <w:t xml:space="preserve">бейне </w:t>
+            </w:r>
+            <w:proofErr w:type="spellStart"/>
+            <w:r>
+              <w:rPr>
+                <w:sz w:val="28"/>
+                <w:szCs w:val="28"/>
+                <w:lang w:val="kk-KZ"/>
+              </w:rPr>
+              <w:t>уникализациясы</w:t>
+            </w:r>
+            <w:proofErr w:type="spellEnd"/>
+            <w:r>
+              <w:rPr>
+                <w:sz w:val="28"/>
+                <w:szCs w:val="28"/>
+                <w:lang w:val="kk-KZ"/>
+              </w:rPr>
+              <w:t xml:space="preserve"> және монтаж</w:t>
+            </w:r>
+          </w:p>
+        </w:tc>
+      </w:tr>
+    </w:tbl>
     <w:p>
       <w:pPr>
         <w:jc w:val="both"/>

</xml_diff>

<commit_message>
Added audit checklist and refactoring plan
Added audit checklist and refactoring plan
</commit_message>
<xml_diff>
--- a/РТД модуль 1.docx
+++ b/РТД модуль 1.docx
@@ -3640,6 +3640,440 @@
         </w:tc>
       </w:tr>
     </w:tbl>
+    <w:p>
+      <w:pPr>
+        <w:jc w:val="both"/>
+        <w:rPr>
+          <w:sz w:val="28"/>
+          <w:szCs w:val="28"/>
+          <w:lang w:val="kk-KZ"/>
+        </w:rPr>
+      </w:pPr>
+      <w:r>
+        <w:rPr>
+          <w:b/>
+          <w:bCs/>
+          <w:sz w:val="28"/>
+          <w:szCs w:val="28"/>
+          <w:lang w:val="kk-KZ"/>
+        </w:rPr>
+        <w:t>3-Тарау</w:t>
+      </w:r>
+      <w:r>
+        <w:rPr>
+          <w:sz w:val="28"/>
+          <w:szCs w:val="28"/>
+          <w:lang w:val="kk-KZ"/>
+        </w:rPr>
+        <w:t>. Құжаттаманы басқару</w:t>
+      </w:r>
+    </w:p>
+    <w:p>
+      <w:pPr>
+        <w:jc w:val="both"/>
+        <w:rPr>
+          <w:sz w:val="28"/>
+          <w:szCs w:val="28"/>
+          <w:lang w:val="kk-KZ"/>
+        </w:rPr>
+      </w:pPr>
+      <w:r>
+        <w:rPr>
+          <w:sz w:val="28"/>
+          <w:szCs w:val="28"/>
+          <w:lang w:val="kk-KZ"/>
+        </w:rPr>
+        <w:t xml:space="preserve">Жоба нұсқаларын басқару үшін </w:t>
+      </w:r>
+      <w:proofErr w:type="spellStart"/>
+      <w:r>
+        <w:rPr>
+          <w:sz w:val="28"/>
+          <w:szCs w:val="28"/>
+          <w:lang w:val="kk-KZ"/>
+        </w:rPr>
+        <w:t>Git</w:t>
+      </w:r>
+      <w:proofErr w:type="spellEnd"/>
+      <w:r>
+        <w:rPr>
+          <w:sz w:val="28"/>
+          <w:szCs w:val="28"/>
+          <w:lang w:val="kk-KZ"/>
+        </w:rPr>
+        <w:t xml:space="preserve"> жүйесі қолданылады. </w:t>
+      </w:r>
+      <w:proofErr w:type="spellStart"/>
+      <w:r>
+        <w:rPr>
+          <w:sz w:val="28"/>
+          <w:szCs w:val="28"/>
+          <w:lang w:val="kk-KZ"/>
+        </w:rPr>
+        <w:t>Git</w:t>
+      </w:r>
+      <w:proofErr w:type="spellEnd"/>
+      <w:r>
+        <w:rPr>
+          <w:sz w:val="28"/>
+          <w:szCs w:val="28"/>
+          <w:lang w:val="kk-KZ"/>
+        </w:rPr>
+        <w:t xml:space="preserve"> өзгерістер тарихын сақтауға және құжаттаманы басқаруға мүмкіндік береді.</w:t>
+      </w:r>
+    </w:p>
+    <w:p>
+      <w:pPr>
+        <w:jc w:val="both"/>
+        <w:rPr>
+          <w:sz w:val="28"/>
+          <w:szCs w:val="28"/>
+          <w:lang w:val="kk-KZ"/>
+        </w:rPr>
+      </w:pPr>
+    </w:p>
+    <w:p>
+      <w:pPr>
+        <w:jc w:val="both"/>
+        <w:rPr>
+          <w:b/>
+          <w:bCs/>
+          <w:sz w:val="28"/>
+          <w:szCs w:val="28"/>
+          <w:lang w:val="kk-KZ"/>
+        </w:rPr>
+      </w:pPr>
+      <w:proofErr w:type="spellStart"/>
+      <w:r>
+        <w:rPr>
+          <w:b/>
+          <w:bCs/>
+          <w:sz w:val="28"/>
+          <w:szCs w:val="28"/>
+          <w:lang w:val="kk-KZ"/>
+        </w:rPr>
+        <w:t>Audit</w:t>
+      </w:r>
+      <w:proofErr w:type="spellEnd"/>
+      <w:r>
+        <w:rPr>
+          <w:b/>
+          <w:bCs/>
+          <w:sz w:val="28"/>
+          <w:szCs w:val="28"/>
+          <w:lang w:val="kk-KZ"/>
+        </w:rPr>
+        <w:t xml:space="preserve"> </w:t>
+      </w:r>
+      <w:proofErr w:type="spellStart"/>
+      <w:r>
+        <w:rPr>
+          <w:b/>
+          <w:bCs/>
+          <w:sz w:val="28"/>
+          <w:szCs w:val="28"/>
+          <w:lang w:val="kk-KZ"/>
+        </w:rPr>
+        <w:t>Checklist</w:t>
+      </w:r>
+      <w:proofErr w:type="spellEnd"/>
+    </w:p>
+    <w:p>
+      <w:pPr>
+        <w:jc w:val="both"/>
+        <w:rPr>
+          <w:sz w:val="28"/>
+          <w:szCs w:val="28"/>
+          <w:lang w:val="kk-KZ"/>
+        </w:rPr>
+      </w:pPr>
+      <w:r>
+        <w:rPr>
+          <w:rFonts w:ascii="Segoe UI Symbol" w:hAnsi="Segoe UI Symbol" w:cs="Segoe UI Symbol"/>
+          <w:sz w:val="28"/>
+          <w:szCs w:val="28"/>
+          <w:lang w:val="kk-KZ"/>
+        </w:rPr>
+        <w:t>☐</w:t>
+      </w:r>
+      <w:r>
+        <w:rPr>
+          <w:sz w:val="28"/>
+          <w:szCs w:val="28"/>
+          <w:lang w:val="kk-KZ"/>
+        </w:rPr>
+        <w:t xml:space="preserve"> Кіріспе бөлімі бар</w:t>
+      </w:r>
+    </w:p>
+    <w:p>
+      <w:pPr>
+        <w:jc w:val="both"/>
+        <w:rPr>
+          <w:sz w:val="28"/>
+          <w:szCs w:val="28"/>
+          <w:lang w:val="kk-KZ"/>
+        </w:rPr>
+      </w:pPr>
+      <w:r>
+        <w:rPr>
+          <w:rFonts w:ascii="Segoe UI Symbol" w:hAnsi="Segoe UI Symbol" w:cs="Segoe UI Symbol"/>
+          <w:sz w:val="28"/>
+          <w:szCs w:val="28"/>
+          <w:lang w:val="kk-KZ"/>
+        </w:rPr>
+        <w:t>☐</w:t>
+      </w:r>
+      <w:r>
+        <w:rPr>
+          <w:sz w:val="28"/>
+          <w:szCs w:val="28"/>
+          <w:lang w:val="kk-KZ"/>
+        </w:rPr>
+        <w:t xml:space="preserve"> Теориялық бөлім жазылған</w:t>
+      </w:r>
+    </w:p>
+    <w:p>
+      <w:pPr>
+        <w:jc w:val="both"/>
+        <w:rPr>
+          <w:sz w:val="28"/>
+          <w:szCs w:val="28"/>
+          <w:lang w:val="kk-KZ"/>
+        </w:rPr>
+      </w:pPr>
+      <w:r>
+        <w:rPr>
+          <w:rFonts w:ascii="Segoe UI Symbol" w:hAnsi="Segoe UI Symbol" w:cs="Segoe UI Symbol"/>
+          <w:sz w:val="28"/>
+          <w:szCs w:val="28"/>
+          <w:lang w:val="kk-KZ"/>
+        </w:rPr>
+        <w:t>☐</w:t>
+      </w:r>
+      <w:r>
+        <w:rPr>
+          <w:sz w:val="28"/>
+          <w:szCs w:val="28"/>
+          <w:lang w:val="kk-KZ"/>
+        </w:rPr>
+        <w:t xml:space="preserve"> Терминдер анықталған</w:t>
+      </w:r>
+    </w:p>
+    <w:p>
+      <w:pPr>
+        <w:jc w:val="both"/>
+        <w:rPr>
+          <w:sz w:val="28"/>
+          <w:szCs w:val="28"/>
+          <w:lang w:val="kk-KZ"/>
+        </w:rPr>
+      </w:pPr>
+      <w:r>
+        <w:rPr>
+          <w:rFonts w:ascii="Segoe UI Symbol" w:hAnsi="Segoe UI Symbol" w:cs="Segoe UI Symbol"/>
+          <w:sz w:val="28"/>
+          <w:szCs w:val="28"/>
+          <w:lang w:val="kk-KZ"/>
+        </w:rPr>
+        <w:t>☐</w:t>
+      </w:r>
+      <w:r>
+        <w:rPr>
+          <w:sz w:val="28"/>
+          <w:szCs w:val="28"/>
+          <w:lang w:val="kk-KZ"/>
+        </w:rPr>
+        <w:t xml:space="preserve"> Кесте қосылған</w:t>
+      </w:r>
+    </w:p>
+    <w:p>
+      <w:pPr>
+        <w:jc w:val="both"/>
+        <w:rPr>
+          <w:sz w:val="28"/>
+          <w:szCs w:val="28"/>
+          <w:lang w:val="kk-KZ"/>
+        </w:rPr>
+      </w:pPr>
+      <w:r>
+        <w:rPr>
+          <w:rFonts w:ascii="Segoe UI Symbol" w:hAnsi="Segoe UI Symbol" w:cs="Segoe UI Symbol"/>
+          <w:sz w:val="28"/>
+          <w:szCs w:val="28"/>
+          <w:lang w:val="kk-KZ"/>
+        </w:rPr>
+        <w:t>☐</w:t>
+      </w:r>
+      <w:r>
+        <w:rPr>
+          <w:sz w:val="28"/>
+          <w:szCs w:val="28"/>
+          <w:lang w:val="kk-KZ"/>
+        </w:rPr>
+        <w:t xml:space="preserve"> Диаграмма бар</w:t>
+      </w:r>
+    </w:p>
+    <w:p>
+      <w:pPr>
+        <w:jc w:val="both"/>
+        <w:rPr>
+          <w:sz w:val="28"/>
+          <w:szCs w:val="28"/>
+          <w:lang w:val="kk-KZ"/>
+        </w:rPr>
+      </w:pPr>
+      <w:r>
+        <w:rPr>
+          <w:rFonts w:ascii="Segoe UI Symbol" w:hAnsi="Segoe UI Symbol" w:cs="Segoe UI Symbol"/>
+          <w:sz w:val="28"/>
+          <w:szCs w:val="28"/>
+          <w:lang w:val="kk-KZ"/>
+        </w:rPr>
+        <w:t>☐</w:t>
+      </w:r>
+      <w:r>
+        <w:rPr>
+          <w:sz w:val="28"/>
+          <w:szCs w:val="28"/>
+          <w:lang w:val="kk-KZ"/>
+        </w:rPr>
+        <w:t xml:space="preserve"> Құжат құрылымы дұрыс</w:t>
+      </w:r>
+    </w:p>
+    <w:p>
+      <w:pPr>
+        <w:jc w:val="both"/>
+        <w:rPr>
+          <w:sz w:val="28"/>
+          <w:szCs w:val="28"/>
+          <w:lang w:val="kk-KZ"/>
+        </w:rPr>
+      </w:pPr>
+    </w:p>
+    <w:p>
+      <w:pPr>
+        <w:jc w:val="both"/>
+        <w:rPr>
+          <w:b/>
+          <w:bCs/>
+          <w:sz w:val="28"/>
+          <w:szCs w:val="28"/>
+          <w:lang w:val="kk-KZ"/>
+        </w:rPr>
+      </w:pPr>
+      <w:proofErr w:type="spellStart"/>
+      <w:r>
+        <w:rPr>
+          <w:b/>
+          <w:bCs/>
+          <w:sz w:val="28"/>
+          <w:szCs w:val="28"/>
+          <w:lang w:val="kk-KZ"/>
+        </w:rPr>
+        <w:t>Refactoring</w:t>
+      </w:r>
+      <w:proofErr w:type="spellEnd"/>
+      <w:r>
+        <w:rPr>
+          <w:b/>
+          <w:bCs/>
+          <w:sz w:val="28"/>
+          <w:szCs w:val="28"/>
+          <w:lang w:val="kk-KZ"/>
+        </w:rPr>
+        <w:t xml:space="preserve"> жоспары</w:t>
+      </w:r>
+    </w:p>
+    <w:p>
+      <w:pPr>
+        <w:jc w:val="both"/>
+        <w:rPr>
+          <w:sz w:val="28"/>
+          <w:szCs w:val="28"/>
+          <w:lang w:val="kk-KZ"/>
+        </w:rPr>
+      </w:pPr>
+      <w:r>
+        <w:rPr>
+          <w:sz w:val="28"/>
+          <w:szCs w:val="28"/>
+          <w:lang w:val="kk-KZ"/>
+        </w:rPr>
+        <w:t>Қосымша ғылыми дереккөздер қосу</w:t>
+      </w:r>
+    </w:p>
+    <w:p>
+      <w:pPr>
+        <w:jc w:val="both"/>
+        <w:rPr>
+          <w:sz w:val="28"/>
+          <w:szCs w:val="28"/>
+          <w:lang w:val="kk-KZ"/>
+        </w:rPr>
+      </w:pPr>
+      <w:r>
+        <w:rPr>
+          <w:sz w:val="28"/>
+          <w:szCs w:val="28"/>
+          <w:lang w:val="kk-KZ"/>
+        </w:rPr>
+        <w:t>Қолданыстағы жүйелерді талдауды кеңейту</w:t>
+      </w:r>
+    </w:p>
+    <w:p>
+      <w:pPr>
+        <w:jc w:val="both"/>
+        <w:rPr>
+          <w:sz w:val="28"/>
+          <w:szCs w:val="28"/>
+          <w:lang w:val="kk-KZ"/>
+        </w:rPr>
+      </w:pPr>
+      <w:r>
+        <w:rPr>
+          <w:sz w:val="28"/>
+          <w:szCs w:val="28"/>
+          <w:lang w:val="kk-KZ"/>
+        </w:rPr>
+        <w:t>Қосымша диаграммалар жасау</w:t>
+      </w:r>
+    </w:p>
+    <w:p>
+      <w:pPr>
+        <w:jc w:val="both"/>
+        <w:rPr>
+          <w:sz w:val="28"/>
+          <w:szCs w:val="28"/>
+          <w:lang w:val="kk-KZ"/>
+        </w:rPr>
+      </w:pPr>
+      <w:r>
+        <w:rPr>
+          <w:sz w:val="28"/>
+          <w:szCs w:val="28"/>
+          <w:lang w:val="kk-KZ"/>
+        </w:rPr>
+        <w:t>Архитектура сипаттамасын толықтыру</w:t>
+      </w:r>
+    </w:p>
+    <w:p>
+      <w:pPr>
+        <w:jc w:val="both"/>
+        <w:rPr>
+          <w:sz w:val="28"/>
+          <w:szCs w:val="28"/>
+          <w:lang w:val="kk-KZ"/>
+        </w:rPr>
+      </w:pPr>
+      <w:r>
+        <w:rPr>
+          <w:sz w:val="28"/>
+          <w:szCs w:val="28"/>
+          <w:lang w:val="kk-KZ"/>
+        </w:rPr>
+        <w:t>Құжат құрылымын жақсарту</w:t>
+      </w:r>
+    </w:p>
     <w:p>
       <w:pPr>
         <w:jc w:val="both"/>

</xml_diff>

<commit_message>
Final version: formatting and conclusion
Final version: formatting and conclusion
</commit_message>
<xml_diff>
--- a/РТД модуль 1.docx
+++ b/РТД модуль 1.docx
@@ -4083,6 +4083,296 @@
           <w:lang w:val="kk-KZ"/>
         </w:rPr>
       </w:pPr>
+    </w:p>
+    <w:p>
+      <w:pPr>
+        <w:jc w:val="both"/>
+        <w:rPr>
+          <w:sz w:val="28"/>
+          <w:szCs w:val="28"/>
+          <w:lang w:val="kk-KZ"/>
+        </w:rPr>
+      </w:pPr>
+    </w:p>
+    <w:p>
+      <w:pPr>
+        <w:jc w:val="both"/>
+        <w:rPr>
+          <w:sz w:val="28"/>
+          <w:szCs w:val="28"/>
+          <w:lang w:val="kk-KZ"/>
+        </w:rPr>
+      </w:pPr>
+    </w:p>
+    <w:p>
+      <w:pPr>
+        <w:jc w:val="both"/>
+        <w:rPr>
+          <w:sz w:val="28"/>
+          <w:szCs w:val="28"/>
+          <w:lang w:val="kk-KZ"/>
+        </w:rPr>
+      </w:pPr>
+    </w:p>
+    <w:p>
+      <w:pPr>
+        <w:jc w:val="both"/>
+        <w:rPr>
+          <w:sz w:val="28"/>
+          <w:szCs w:val="28"/>
+          <w:lang w:val="kk-KZ"/>
+        </w:rPr>
+      </w:pPr>
+    </w:p>
+    <w:p>
+      <w:pPr>
+        <w:jc w:val="both"/>
+        <w:rPr>
+          <w:sz w:val="28"/>
+          <w:szCs w:val="28"/>
+          <w:lang w:val="kk-KZ"/>
+        </w:rPr>
+      </w:pPr>
+    </w:p>
+    <w:p>
+      <w:pPr>
+        <w:jc w:val="both"/>
+        <w:rPr>
+          <w:sz w:val="28"/>
+          <w:szCs w:val="28"/>
+          <w:lang w:val="kk-KZ"/>
+        </w:rPr>
+      </w:pPr>
+    </w:p>
+    <w:p>
+      <w:pPr>
+        <w:jc w:val="both"/>
+        <w:rPr>
+          <w:sz w:val="28"/>
+          <w:szCs w:val="28"/>
+          <w:lang w:val="kk-KZ"/>
+        </w:rPr>
+      </w:pPr>
+    </w:p>
+    <w:p>
+      <w:pPr>
+        <w:jc w:val="both"/>
+        <w:rPr>
+          <w:sz w:val="28"/>
+          <w:szCs w:val="28"/>
+          <w:lang w:val="kk-KZ"/>
+        </w:rPr>
+      </w:pPr>
+    </w:p>
+    <w:p>
+      <w:pPr>
+        <w:jc w:val="both"/>
+        <w:rPr>
+          <w:sz w:val="28"/>
+          <w:szCs w:val="28"/>
+          <w:lang w:val="kk-KZ"/>
+        </w:rPr>
+      </w:pPr>
+    </w:p>
+    <w:p>
+      <w:pPr>
+        <w:jc w:val="both"/>
+        <w:rPr>
+          <w:sz w:val="28"/>
+          <w:szCs w:val="28"/>
+          <w:lang w:val="kk-KZ"/>
+        </w:rPr>
+      </w:pPr>
+    </w:p>
+    <w:p>
+      <w:pPr>
+        <w:jc w:val="both"/>
+        <w:rPr>
+          <w:sz w:val="28"/>
+          <w:szCs w:val="28"/>
+          <w:lang w:val="kk-KZ"/>
+        </w:rPr>
+      </w:pPr>
+    </w:p>
+    <w:p>
+      <w:pPr>
+        <w:jc w:val="both"/>
+        <w:rPr>
+          <w:sz w:val="28"/>
+          <w:szCs w:val="28"/>
+          <w:lang w:val="kk-KZ"/>
+        </w:rPr>
+      </w:pPr>
+    </w:p>
+    <w:p>
+      <w:pPr>
+        <w:jc w:val="both"/>
+        <w:rPr>
+          <w:sz w:val="28"/>
+          <w:szCs w:val="28"/>
+          <w:lang w:val="kk-KZ"/>
+        </w:rPr>
+      </w:pPr>
+    </w:p>
+    <w:p>
+      <w:pPr>
+        <w:jc w:val="both"/>
+        <w:rPr>
+          <w:sz w:val="28"/>
+          <w:szCs w:val="28"/>
+          <w:lang w:val="kk-KZ"/>
+        </w:rPr>
+      </w:pPr>
+    </w:p>
+    <w:p>
+      <w:pPr>
+        <w:jc w:val="both"/>
+        <w:rPr>
+          <w:sz w:val="28"/>
+          <w:szCs w:val="28"/>
+          <w:lang w:val="kk-KZ"/>
+        </w:rPr>
+      </w:pPr>
+    </w:p>
+    <w:p>
+      <w:pPr>
+        <w:jc w:val="both"/>
+        <w:rPr>
+          <w:sz w:val="28"/>
+          <w:szCs w:val="28"/>
+          <w:lang w:val="kk-KZ"/>
+        </w:rPr>
+      </w:pPr>
+    </w:p>
+    <w:p>
+      <w:pPr>
+        <w:jc w:val="both"/>
+        <w:rPr>
+          <w:sz w:val="28"/>
+          <w:szCs w:val="28"/>
+          <w:lang w:val="kk-KZ"/>
+        </w:rPr>
+      </w:pPr>
+    </w:p>
+    <w:p>
+      <w:pPr>
+        <w:jc w:val="both"/>
+        <w:rPr>
+          <w:sz w:val="28"/>
+          <w:szCs w:val="28"/>
+          <w:lang w:val="kk-KZ"/>
+        </w:rPr>
+      </w:pPr>
+    </w:p>
+    <w:p>
+      <w:pPr>
+        <w:jc w:val="both"/>
+        <w:rPr>
+          <w:sz w:val="28"/>
+          <w:szCs w:val="28"/>
+          <w:lang w:val="kk-KZ"/>
+        </w:rPr>
+      </w:pPr>
+    </w:p>
+    <w:p>
+      <w:pPr>
+        <w:jc w:val="both"/>
+        <w:rPr>
+          <w:sz w:val="28"/>
+          <w:szCs w:val="28"/>
+          <w:lang w:val="kk-KZ"/>
+        </w:rPr>
+      </w:pPr>
+    </w:p>
+    <w:p>
+      <w:pPr>
+        <w:jc w:val="both"/>
+        <w:rPr>
+          <w:sz w:val="28"/>
+          <w:szCs w:val="28"/>
+          <w:lang w:val="kk-KZ"/>
+        </w:rPr>
+      </w:pPr>
+    </w:p>
+    <w:p>
+      <w:pPr>
+        <w:jc w:val="both"/>
+        <w:rPr>
+          <w:sz w:val="28"/>
+          <w:szCs w:val="28"/>
+          <w:lang w:val="kk-KZ"/>
+        </w:rPr>
+      </w:pPr>
+    </w:p>
+    <w:p>
+      <w:pPr>
+        <w:jc w:val="both"/>
+        <w:rPr>
+          <w:sz w:val="28"/>
+          <w:szCs w:val="28"/>
+          <w:lang w:val="kk-KZ"/>
+        </w:rPr>
+      </w:pPr>
+    </w:p>
+    <w:p>
+      <w:pPr>
+        <w:jc w:val="both"/>
+        <w:rPr>
+          <w:sz w:val="28"/>
+          <w:szCs w:val="28"/>
+          <w:lang w:val="kk-KZ"/>
+        </w:rPr>
+      </w:pPr>
+    </w:p>
+    <w:p>
+      <w:pPr>
+        <w:jc w:val="both"/>
+        <w:rPr>
+          <w:sz w:val="28"/>
+          <w:szCs w:val="28"/>
+          <w:lang w:val="kk-KZ"/>
+        </w:rPr>
+      </w:pPr>
+    </w:p>
+    <w:p>
+      <w:pPr>
+        <w:jc w:val="both"/>
+        <w:rPr>
+          <w:b/>
+          <w:bCs/>
+          <w:sz w:val="28"/>
+          <w:szCs w:val="28"/>
+          <w:lang w:val="kk-KZ"/>
+        </w:rPr>
+      </w:pPr>
+      <w:r>
+        <w:rPr>
+          <w:b/>
+          <w:bCs/>
+          <w:sz w:val="28"/>
+          <w:szCs w:val="28"/>
+          <w:lang w:val="kk-KZ"/>
+        </w:rPr>
+        <w:t>Қорытынды</w:t>
+      </w:r>
+    </w:p>
+    <w:p>
+      <w:pPr>
+        <w:jc w:val="both"/>
+        <w:rPr>
+          <w:sz w:val="28"/>
+          <w:szCs w:val="28"/>
+          <w:lang w:val="kk-KZ"/>
+        </w:rPr>
+      </w:pPr>
+      <w:r>
+        <w:rPr>
+          <w:sz w:val="28"/>
+          <w:szCs w:val="28"/>
+          <w:lang w:val="kk-KZ"/>
+        </w:rPr>
+        <w:t>Бұл жұмыста мультимедиялық контентті автоматты түрде генерациялайтын AI-қосымшасының концепциясы ұсынылды. Жүйенің архитектурасы және негізгі модульдері сипатталды.</w:t>
+      </w:r>
     </w:p>
     <w:sectPr>
       <w:pgSz w:w="11906" w:h="16838"/>

</xml_diff>